<commit_message>
p10-penambahan JSNON dua arah
</commit_message>
<xml_diff>
--- a/pertemuan 10/10. Worksheet_PABW_Pertemuan10 - ID (revisi sinkron v2).docx
+++ b/pertemuan 10/10. Worksheet_PABW_Pertemuan10 - ID (revisi sinkron v2).docx
@@ -6415,6 +6415,15 @@
             <w:pPr>
               <w:spacing w:after="0"/>
             </w:pPr>
+            <w:r>
+              <w:t>J</w:t>
+            </w:r>
+            <w:r>
+              <w:t>udul</w:t>
+            </w:r>
+            <w:r>
+              <w:t xml:space="preserve"> </w:t>
+            </w:r>
           </w:p>
         </w:tc>
         <w:tc>
@@ -6449,7 +6458,15 @@
                 <w:sz w:val="18"/>
                 <w:szCs w:val="18"/>
               </w:rPr>
-              <w:t>data.____</w:t>
+              <w:t>data.</w:t>
+            </w:r>
+            <w:r>
+              <w:rPr>
+                <w:color w:val="1A1A2E"/>
+                <w:sz w:val="18"/>
+                <w:szCs w:val="18"/>
+              </w:rPr>
+              <w:t>judul</w:t>
             </w:r>
           </w:p>
         </w:tc>
@@ -6467,6 +6484,12 @@
             <w:pPr>
               <w:spacing w:after="0"/>
             </w:pPr>
+            <w:r>
+              <w:t>b</w:t>
+            </w:r>
+            <w:r>
+              <w:t xml:space="preserve">uku </w:t>
+            </w:r>
           </w:p>
         </w:tc>
         <w:tc>
@@ -6501,7 +6524,31 @@
                 <w:sz w:val="18"/>
                 <w:szCs w:val="18"/>
               </w:rPr>
-              <w:t>data.____.forEach(____)</w:t>
+              <w:t>d</w:t>
+            </w:r>
+            <w:r>
+              <w:rPr>
+                <w:color w:val="1A1A2E"/>
+                <w:sz w:val="18"/>
+                <w:szCs w:val="18"/>
+              </w:rPr>
+              <w:t>ata</w:t>
+            </w:r>
+            <w:r>
+              <w:rPr>
+                <w:color w:val="1A1A2E"/>
+                <w:sz w:val="18"/>
+                <w:szCs w:val="18"/>
+              </w:rPr>
+              <w:t>.</w:t>
+            </w:r>
+            <w:r>
+              <w:rPr>
+                <w:color w:val="1A1A2E"/>
+                <w:sz w:val="18"/>
+                <w:szCs w:val="18"/>
+              </w:rPr>
+              <w:t>forEach()</w:t>
             </w:r>
           </w:p>
         </w:tc>
@@ -6519,6 +6566,9 @@
             <w:pPr>
               <w:spacing w:after="0"/>
             </w:pPr>
+            <w:r>
+              <w:t>tahun</w:t>
+            </w:r>
           </w:p>
         </w:tc>
         <w:tc>
@@ -6535,7 +6585,7 @@
                 <w:sz w:val="18"/>
                 <w:szCs w:val="18"/>
               </w:rPr>
-              <w:t>teks atau angka</w:t>
+              <w:t>angka</w:t>
             </w:r>
           </w:p>
         </w:tc>
@@ -6553,7 +6603,15 @@
                 <w:sz w:val="18"/>
                 <w:szCs w:val="18"/>
               </w:rPr>
-              <w:t>data.____</w:t>
+              <w:t>data.</w:t>
+            </w:r>
+            <w:r>
+              <w:rPr>
+                <w:color w:val="1A1A2E"/>
+                <w:sz w:val="18"/>
+                <w:szCs w:val="18"/>
+              </w:rPr>
+              <w:t>tahun</w:t>
             </w:r>
           </w:p>
         </w:tc>
@@ -6571,6 +6629,9 @@
             <w:pPr>
               <w:spacing w:after="0"/>
             </w:pPr>
+            <w:r>
+              <w:t>tersedia</w:t>
+            </w:r>
           </w:p>
         </w:tc>
         <w:tc>
@@ -6587,7 +6648,7 @@
                 <w:sz w:val="18"/>
                 <w:szCs w:val="18"/>
               </w:rPr>
-              <w:t>benar atau salah, atau null</w:t>
+              <w:t>true</w:t>
             </w:r>
           </w:p>
         </w:tc>
@@ -6605,7 +6666,15 @@
                 <w:sz w:val="18"/>
                 <w:szCs w:val="18"/>
               </w:rPr>
-              <w:t>data.____</w:t>
+              <w:t>data.</w:t>
+            </w:r>
+            <w:r>
+              <w:rPr>
+                <w:color w:val="1A1A2E"/>
+                <w:sz w:val="18"/>
+                <w:szCs w:val="18"/>
+              </w:rPr>
+              <w:t>tersedia</w:t>
             </w:r>
           </w:p>
         </w:tc>

</xml_diff>